<commit_message>
feat(lakeshore): upgrade pack with technical architecture SVGs + enriched docs
</commit_message>
<xml_diff>
--- a/docs/build/lakeshore-enterprise-context/source/05_treasury_kyriba/kyriba_integration_design.docx
+++ b/docs/build/lakeshore-enterprise-context/source/05_treasury_kyriba/kyriba_integration_design.docx
@@ -24,12 +24,398 @@
         <w:pStyle w:val="Heading1"/>
       </w:pPr>
       <w:r>
-        <w:t>Overview</w:t>
+        <w:t>Interfaces</w:t>
+      </w:r>
+    </w:p>
+    <w:tbl>
+      <w:tblPr>
+        <w:tblStyle w:val="LightGrid-Accent1"/>
+        <w:tblW w:type="auto" w:w="0"/>
+        <w:tblLook w:firstColumn="1" w:firstRow="1" w:lastColumn="0" w:lastRow="0" w:noHBand="0" w:noVBand="1" w:val="04A0"/>
+      </w:tblPr>
+      <w:tblGrid>
+        <w:gridCol w:w="1728"/>
+        <w:gridCol w:w="1728"/>
+        <w:gridCol w:w="1728"/>
+        <w:gridCol w:w="1728"/>
+        <w:gridCol w:w="1728"/>
+      </w:tblGrid>
+      <w:tr>
+        <w:tc>
+          <w:tcPr>
+            <w:tcW w:type="dxa" w:w="1728"/>
+          </w:tcPr>
+          <w:p>
+            <w:r>
+              <w:t>Interface</w:t>
+            </w:r>
+          </w:p>
+        </w:tc>
+        <w:tc>
+          <w:tcPr>
+            <w:tcW w:type="dxa" w:w="1728"/>
+          </w:tcPr>
+          <w:p>
+            <w:r>
+              <w:t>Direction</w:t>
+            </w:r>
+          </w:p>
+        </w:tc>
+        <w:tc>
+          <w:tcPr>
+            <w:tcW w:type="dxa" w:w="1728"/>
+          </w:tcPr>
+          <w:p>
+            <w:r>
+              <w:t>Format</w:t>
+            </w:r>
+          </w:p>
+        </w:tc>
+        <w:tc>
+          <w:tcPr>
+            <w:tcW w:type="dxa" w:w="1728"/>
+          </w:tcPr>
+          <w:p>
+            <w:r>
+              <w:t>Channel</w:t>
+            </w:r>
+          </w:p>
+        </w:tc>
+        <w:tc>
+          <w:tcPr>
+            <w:tcW w:type="dxa" w:w="1728"/>
+          </w:tcPr>
+          <w:p>
+            <w:r>
+              <w:t>Frequency</w:t>
+            </w:r>
+          </w:p>
+        </w:tc>
+      </w:tr>
+      <w:tr>
+        <w:tc>
+          <w:tcPr>
+            <w:tcW w:type="dxa" w:w="1728"/>
+          </w:tcPr>
+          <w:p>
+            <w:r>
+              <w:t>Payment proposals</w:t>
+            </w:r>
+          </w:p>
+        </w:tc>
+        <w:tc>
+          <w:tcPr>
+            <w:tcW w:type="dxa" w:w="1728"/>
+          </w:tcPr>
+          <w:p>
+            <w:r>
+              <w:t>SAP→Kyriba</w:t>
+            </w:r>
+          </w:p>
+        </w:tc>
+        <w:tc>
+          <w:tcPr>
+            <w:tcW w:type="dxa" w:w="1728"/>
+          </w:tcPr>
+          <w:p>
+            <w:r>
+              <w:t>IDoc PEXR2002</w:t>
+            </w:r>
+          </w:p>
+        </w:tc>
+        <w:tc>
+          <w:tcPr>
+            <w:tcW w:type="dxa" w:w="1728"/>
+          </w:tcPr>
+          <w:p>
+            <w:r>
+              <w:t>ESB</w:t>
+            </w:r>
+          </w:p>
+        </w:tc>
+        <w:tc>
+          <w:tcPr>
+            <w:tcW w:type="dxa" w:w="1728"/>
+          </w:tcPr>
+          <w:p>
+            <w:r>
+              <w:t>hourly</w:t>
+            </w:r>
+          </w:p>
+        </w:tc>
+      </w:tr>
+      <w:tr>
+        <w:tc>
+          <w:tcPr>
+            <w:tcW w:type="dxa" w:w="1728"/>
+          </w:tcPr>
+          <w:p>
+            <w:r>
+              <w:t>Outbound payments</w:t>
+            </w:r>
+          </w:p>
+        </w:tc>
+        <w:tc>
+          <w:tcPr>
+            <w:tcW w:type="dxa" w:w="1728"/>
+          </w:tcPr>
+          <w:p>
+            <w:r>
+              <w:t>Kyriba→Bank</w:t>
+            </w:r>
+          </w:p>
+        </w:tc>
+        <w:tc>
+          <w:tcPr>
+            <w:tcW w:type="dxa" w:w="1728"/>
+          </w:tcPr>
+          <w:p>
+            <w:r>
+              <w:t>pain.001.001.09</w:t>
+            </w:r>
+          </w:p>
+        </w:tc>
+        <w:tc>
+          <w:tcPr>
+            <w:tcW w:type="dxa" w:w="1728"/>
+          </w:tcPr>
+          <w:p>
+            <w:r>
+              <w:t>SFTP/SWIFT</w:t>
+            </w:r>
+          </w:p>
+        </w:tc>
+        <w:tc>
+          <w:tcPr>
+            <w:tcW w:type="dxa" w:w="1728"/>
+          </w:tcPr>
+          <w:p>
+            <w:r>
+              <w:t>intraday</w:t>
+            </w:r>
+          </w:p>
+        </w:tc>
+      </w:tr>
+      <w:tr>
+        <w:tc>
+          <w:tcPr>
+            <w:tcW w:type="dxa" w:w="1728"/>
+          </w:tcPr>
+          <w:p>
+            <w:r>
+              <w:t>Payment status</w:t>
+            </w:r>
+          </w:p>
+        </w:tc>
+        <w:tc>
+          <w:tcPr>
+            <w:tcW w:type="dxa" w:w="1728"/>
+          </w:tcPr>
+          <w:p>
+            <w:r>
+              <w:t>Bank→Kyriba</w:t>
+            </w:r>
+          </w:p>
+        </w:tc>
+        <w:tc>
+          <w:tcPr>
+            <w:tcW w:type="dxa" w:w="1728"/>
+          </w:tcPr>
+          <w:p>
+            <w:r>
+              <w:t>pain.002</w:t>
+            </w:r>
+          </w:p>
+        </w:tc>
+        <w:tc>
+          <w:tcPr>
+            <w:tcW w:type="dxa" w:w="1728"/>
+          </w:tcPr>
+          <w:p>
+            <w:r>
+              <w:t>SFTP</w:t>
+            </w:r>
+          </w:p>
+        </w:tc>
+        <w:tc>
+          <w:tcPr>
+            <w:tcW w:type="dxa" w:w="1728"/>
+          </w:tcPr>
+          <w:p>
+            <w:r>
+              <w:t>intraday</w:t>
+            </w:r>
+          </w:p>
+        </w:tc>
+      </w:tr>
+      <w:tr>
+        <w:tc>
+          <w:tcPr>
+            <w:tcW w:type="dxa" w:w="1728"/>
+          </w:tcPr>
+          <w:p>
+            <w:r>
+              <w:t>Statements</w:t>
+            </w:r>
+          </w:p>
+        </w:tc>
+        <w:tc>
+          <w:tcPr>
+            <w:tcW w:type="dxa" w:w="1728"/>
+          </w:tcPr>
+          <w:p>
+            <w:r>
+              <w:t>Bank→Kyriba</w:t>
+            </w:r>
+          </w:p>
+        </w:tc>
+        <w:tc>
+          <w:tcPr>
+            <w:tcW w:type="dxa" w:w="1728"/>
+          </w:tcPr>
+          <w:p>
+            <w:r>
+              <w:t>camt.053/052</w:t>
+            </w:r>
+          </w:p>
+        </w:tc>
+        <w:tc>
+          <w:tcPr>
+            <w:tcW w:type="dxa" w:w="1728"/>
+          </w:tcPr>
+          <w:p>
+            <w:r>
+              <w:t>SFTP</w:t>
+            </w:r>
+          </w:p>
+        </w:tc>
+        <w:tc>
+          <w:tcPr>
+            <w:tcW w:type="dxa" w:w="1728"/>
+          </w:tcPr>
+          <w:p>
+            <w:r>
+              <w:t>daily/intraday</w:t>
+            </w:r>
+          </w:p>
+        </w:tc>
+      </w:tr>
+      <w:tr>
+        <w:tc>
+          <w:tcPr>
+            <w:tcW w:type="dxa" w:w="1728"/>
+          </w:tcPr>
+          <w:p>
+            <w:r>
+              <w:t>GL recon postings</w:t>
+            </w:r>
+          </w:p>
+        </w:tc>
+        <w:tc>
+          <w:tcPr>
+            <w:tcW w:type="dxa" w:w="1728"/>
+          </w:tcPr>
+          <w:p>
+            <w:r>
+              <w:t>Kyriba→SAP</w:t>
+            </w:r>
+          </w:p>
+        </w:tc>
+        <w:tc>
+          <w:tcPr>
+            <w:tcW w:type="dxa" w:w="1728"/>
+          </w:tcPr>
+          <w:p>
+            <w:r>
+              <w:t>BAPI/IDoc</w:t>
+            </w:r>
+          </w:p>
+        </w:tc>
+        <w:tc>
+          <w:tcPr>
+            <w:tcW w:type="dxa" w:w="1728"/>
+          </w:tcPr>
+          <w:p>
+            <w:r>
+              <w:t>ESB</w:t>
+            </w:r>
+          </w:p>
+        </w:tc>
+        <w:tc>
+          <w:tcPr>
+            <w:tcW w:type="dxa" w:w="1728"/>
+          </w:tcPr>
+          <w:p>
+            <w:r>
+              <w:t>T+1</w:t>
+            </w:r>
+          </w:p>
+        </w:tc>
+      </w:tr>
+      <w:tr>
+        <w:tc>
+          <w:tcPr>
+            <w:tcW w:type="dxa" w:w="1728"/>
+          </w:tcPr>
+          <w:p>
+            <w:r>
+              <w:t>FX rates</w:t>
+            </w:r>
+          </w:p>
+        </w:tc>
+        <w:tc>
+          <w:tcPr>
+            <w:tcW w:type="dxa" w:w="1728"/>
+          </w:tcPr>
+          <w:p>
+            <w:r>
+              <w:t>Refinitiv→Kyriba</w:t>
+            </w:r>
+          </w:p>
+        </w:tc>
+        <w:tc>
+          <w:tcPr>
+            <w:tcW w:type="dxa" w:w="1728"/>
+          </w:tcPr>
+          <w:p>
+            <w:r>
+              <w:t>REST</w:t>
+            </w:r>
+          </w:p>
+        </w:tc>
+        <w:tc>
+          <w:tcPr>
+            <w:tcW w:type="dxa" w:w="1728"/>
+          </w:tcPr>
+          <w:p>
+            <w:r>
+              <w:t>API</w:t>
+            </w:r>
+          </w:p>
+        </w:tc>
+        <w:tc>
+          <w:tcPr>
+            <w:tcW w:type="dxa" w:w="1728"/>
+          </w:tcPr>
+          <w:p>
+            <w:r>
+              <w:t>intraday</w:t>
+            </w:r>
+          </w:p>
+        </w:tc>
+      </w:tr>
+    </w:tbl>
+    <w:p>
+      <w:pPr>
+        <w:pStyle w:val="Heading1"/>
+      </w:pPr>
+      <w:r>
+        <w:t>Connectivity</w:t>
       </w:r>
     </w:p>
     <w:p>
       <w:r>
-        <w:t>Kyriba Integration Design for Lakeshore group treasury (synthetic).</w:t>
+        <w:t>Kyriba bank connectivity uses SWIFT Alliance Lite2 (SCORE) for SWIFT-enabled banks and host-to-host SFTP/EBICS for the remainder; Kyriba's format library handles country-specific ISO20022 variants. Mutual TLS and PGP protect file channels.</w:t>
       </w:r>
     </w:p>
     <w:p>
@@ -37,7 +423,7 @@
         <w:pStyle w:val="Heading1"/>
       </w:pPr>
       <w:r>
-        <w:t>Controls</w:t>
+        <w:t>Design principles</w:t>
       </w:r>
     </w:p>
     <w:p>
@@ -45,7 +431,7 @@
         <w:pStyle w:val="ListBullet"/>
       </w:pPr>
       <w:r>
-        <w:t>Dual authorization on payments</w:t>
+        <w:t>Single payment hub; no direct ERP-to-bank channels.</w:t>
       </w:r>
     </w:p>
     <w:p>
@@ -53,7 +439,7 @@
         <w:pStyle w:val="ListBullet"/>
       </w:pPr>
       <w:r>
-        <w:t>Sanctions screening</w:t>
+        <w:t>Idempotent, replayable interfaces with full audit trail.</w:t>
       </w:r>
     </w:p>
     <w:p>
@@ -61,7 +447,15 @@
         <w:pStyle w:val="ListBullet"/>
       </w:pPr>
       <w:r>
-        <w:t>Payment limits by entity</w:t>
+        <w:t>Clean-core: transformations in Kyriba/ESB, not ERP.</w:t>
+      </w:r>
+    </w:p>
+    <w:p>
+      <w:pPr>
+        <w:pStyle w:val="ListBullet"/>
+      </w:pPr>
+      <w:r>
+        <w:t>Environment parity (DEV/QA/PROD) with masked test data.</w:t>
       </w:r>
     </w:p>
     <w:sectPr>

</xml_diff>